<commit_message>
Refactor thesis template and update architecture tests
- Updated the thesis template to use placeholders for program, title, authors, degree, city, and year.
- Removed deprecated topic keywords from architecture tests.
- Enhanced test for build scripts to ensure no hardcoded diagrams are present.
- Added a new test to check for hardcoded external source URLs in platform scripts.
</commit_message>
<xml_diff>
--- a/platform/templates/styles/caratula.docx
+++ b/platform/templates/styles/caratula.docx
@@ -8,50 +8,7 @@
         <w:spacing w:before="0" w:after="0" w:line="240" w:lineRule="auto"/>
       </w:pPr>
       <w:r>
-        <w:rPr>
-          <w:noProof/>
-        </w:rPr>
-        <w:drawing>
-          <wp:inline distT="0" distB="0" distL="0" distR="0" wp14:anchorId="165390C8" wp14:editId="368B2641">
-            <wp:extent cx="3016250" cy="1419225"/>
-            <wp:effectExtent l="0" t="0" r="0" b="9525"/>
-            <wp:docPr id="25" name="Picture"/>
-            <wp:cNvGraphicFramePr/>
-            <a:graphic xmlns:a="http://schemas.openxmlformats.org/drawingml/2006/main">
-              <a:graphicData uri="http://schemas.openxmlformats.org/drawingml/2006/picture">
-                <pic:pic xmlns:pic="http://schemas.openxmlformats.org/drawingml/2006/picture">
-                  <pic:nvPicPr>
-                    <pic:cNvPr id="26" name="Picture" descr="media/image1.png"/>
-                    <pic:cNvPicPr>
-                      <a:picLocks noChangeAspect="1" noChangeArrowheads="1"/>
-                    </pic:cNvPicPr>
-                  </pic:nvPicPr>
-                  <pic:blipFill>
-                    <a:blip r:embed="rId7"/>
-                    <a:stretch>
-                      <a:fillRect/>
-                    </a:stretch>
-                  </pic:blipFill>
-                  <pic:spPr bwMode="auto">
-                    <a:xfrm>
-                      <a:off x="0" y="0"/>
-                      <a:ext cx="3017521" cy="1419823"/>
-                    </a:xfrm>
-                    <a:prstGeom prst="rect">
-                      <a:avLst/>
-                    </a:prstGeom>
-                    <a:noFill/>
-                    <a:ln w="9525">
-                      <a:noFill/>
-                      <a:headEnd/>
-                      <a:tailEnd/>
-                    </a:ln>
-                  </pic:spPr>
-                </pic:pic>
-              </a:graphicData>
-            </a:graphic>
-          </wp:inline>
-        </w:drawing>
+        <w:t>&lt;PROGRAMA DE POSGRADO&gt;</w:t>
       </w:r>
     </w:p>
     <w:p>
@@ -59,42 +16,17 @@
         <w:pStyle w:val="Portada-Centrado"/>
         <w:spacing w:before="0" w:after="0" w:line="240" w:lineRule="auto"/>
       </w:pPr>
-    </w:p>
-    <w:p>
-      <w:pPr>
-        <w:pStyle w:val="Portada-Centrado"/>
-        <w:spacing w:after="280" w:line="276" w:lineRule="auto"/>
-      </w:pPr>
       <w:r>
-        <w:rPr>
-          <w:b/>
-          <w:bCs/>
-          <w:sz w:val="34"/>
-        </w:rPr>
-        <w:t>MAESTRÍA EN INGENIERÍA DE SOFTWARE</w:t>
-      </w:r>
-    </w:p>
-    <w:p>
-      <w:pPr>
-        <w:pStyle w:val="Portada-Centrado"/>
-        <w:spacing w:after="360" w:line="276" w:lineRule="auto"/>
-      </w:pPr>
-      <w:r>
-        <w:rPr>
-          <w:b/>
-          <w:bCs/>
-          <w:sz w:val="32"/>
-        </w:rPr>
         <w:t>PROYECTO DE TESIS</w:t>
       </w:r>
     </w:p>
     <w:p>
       <w:pPr>
         <w:pStyle w:val="Portada-Centrado"/>
-        <w:spacing w:before="0" w:after="360" w:line="276" w:lineRule="auto"/>
+        <w:spacing w:after="280" w:line="276" w:lineRule="auto"/>
       </w:pPr>
       <w:r>
-        <w:t> </w:t>
+        <w:t>&lt;TITULO DE LA TESIS&gt;</w:t>
       </w:r>
     </w:p>
     <w:p>
@@ -103,47 +35,52 @@
         <w:spacing w:after="360" w:line="276" w:lineRule="auto"/>
       </w:pPr>
       <w:r>
-        <w:rPr>
-          <w:b/>
-          <w:bCs/>
-          <w:sz w:val="36"/>
-        </w:rPr>
-        <w:t>“MODELO DE INTEROPERABILIDAD BASADO EN HL7 FHIR PARA MEJORAR EL INTERCAMBIO DE INFORMACIÓN CLÍNICA EN CENTROS DE SALUD DEL MINSA - PERÚ”</w:t>
-      </w:r>
-    </w:p>
-    <w:p>
-      <w:pPr>
-        <w:pStyle w:val="Portada-Centrado"/>
-        <w:spacing w:before="0" w:after="360" w:line="276" w:lineRule="auto"/>
-      </w:pPr>
-      <w:r>
-        <w:t> </w:t>
-      </w:r>
-    </w:p>
-    <w:p>
-      <w:pPr>
-        <w:pStyle w:val="Portada-Centrado"/>
-        <w:spacing w:after="240" w:line="276" w:lineRule="auto"/>
-      </w:pPr>
-      <w:r>
-        <w:rPr>
-          <w:sz w:val="28"/>
-        </w:rPr>
         <w:t>PRESENTADO POR:</w:t>
       </w:r>
     </w:p>
     <w:p>
       <w:pPr>
         <w:pStyle w:val="Portada-Centrado"/>
+        <w:spacing w:before="0" w:after="360" w:line="276" w:lineRule="auto"/>
+      </w:pPr>
+      <w:r>
+        <w:t>Bach. &lt;AUTOR 1&gt;</w:t>
+      </w:r>
+    </w:p>
+    <w:p>
+      <w:pPr>
+        <w:pStyle w:val="Portada-Centrado"/>
+        <w:spacing w:after="360" w:line="276" w:lineRule="auto"/>
+      </w:pPr>
+      <w:r>
+        <w:t>Bach. &lt;AUTOR 2&gt;</w:t>
+      </w:r>
+    </w:p>
+    <w:p>
+      <w:pPr>
+        <w:pStyle w:val="Portada-Centrado"/>
+        <w:spacing w:before="0" w:after="360" w:line="276" w:lineRule="auto"/>
+      </w:pPr>
+      <w:r>
+        <w:t>Bach. &lt;AUTOR 3&gt;</w:t>
+      </w:r>
+    </w:p>
+    <w:p>
+      <w:pPr>
+        <w:pStyle w:val="Portada-Centrado"/>
+        <w:spacing w:after="240" w:line="276" w:lineRule="auto"/>
+      </w:pPr>
+      <w:r>
+        <w:t>PARA OPTAR EL GRADO ACADEMICO DE:</w:t>
+      </w:r>
+    </w:p>
+    <w:p>
+      <w:pPr>
+        <w:pStyle w:val="Portada-Centrado"/>
         <w:spacing w:after="140" w:line="276" w:lineRule="auto"/>
       </w:pPr>
       <w:r>
-        <w:rPr>
-          <w:b/>
-          <w:bCs/>
-          <w:sz w:val="28"/>
-        </w:rPr>
-        <w:t>Bach. Cangalaya Carrasco Henry Miguel</w:t>
+        <w:t>&lt;GRADO ACADEMICO&gt;</w:t>
       </w:r>
     </w:p>
     <w:p>
@@ -155,148 +92,59 @@
         </w:rPr>
       </w:pPr>
       <w:r>
-        <w:rPr>
-          <w:b/>
-          <w:bCs/>
-          <w:sz w:val="28"/>
-          <w:lang w:val="en-US"/>
-        </w:rPr>
-        <w:t xml:space="preserve">Bach. Guzmán Vargas </w:t>
-      </w:r>
-      <w:proofErr w:type="spellStart"/>
-      <w:r>
-        <w:rPr>
-          <w:b/>
-          <w:bCs/>
-          <w:sz w:val="28"/>
-          <w:lang w:val="en-US"/>
-        </w:rPr>
-        <w:t>Jhessel</w:t>
-      </w:r>
-      <w:proofErr w:type="spellEnd"/>
-    </w:p>
-    <w:p>
-      <w:pPr>
-        <w:pStyle w:val="Portada-Centrado"/>
-        <w:spacing w:after="140" w:line="276" w:lineRule="auto"/>
-      </w:pPr>
-      <w:r>
-        <w:rPr>
-          <w:b/>
-          <w:bCs/>
-          <w:sz w:val="28"/>
-          <w:lang w:val="en-US"/>
-        </w:rPr>
-        <w:t xml:space="preserve">Bach. </w:t>
-      </w:r>
-      <w:r>
-        <w:rPr>
-          <w:b/>
-          <w:bCs/>
-          <w:sz w:val="28"/>
-        </w:rPr>
-        <w:t xml:space="preserve">Yanqui Rivera </w:t>
-      </w:r>
-      <w:proofErr w:type="spellStart"/>
-      <w:r>
-        <w:rPr>
-          <w:b/>
-          <w:bCs/>
-          <w:sz w:val="28"/>
-        </w:rPr>
-        <w:t>Maria</w:t>
-      </w:r>
-      <w:proofErr w:type="spellEnd"/>
-      <w:r>
-        <w:rPr>
-          <w:b/>
-          <w:bCs/>
-          <w:sz w:val="28"/>
-        </w:rPr>
-        <w:t xml:space="preserve"> de los </w:t>
-      </w:r>
-      <w:proofErr w:type="spellStart"/>
-      <w:r>
-        <w:rPr>
-          <w:b/>
-          <w:bCs/>
-          <w:sz w:val="28"/>
-        </w:rPr>
-        <w:t>Angeles</w:t>
-      </w:r>
-      <w:proofErr w:type="spellEnd"/>
-    </w:p>
-    <w:p>
-      <w:pPr>
-        <w:pStyle w:val="Portada-Centrado"/>
-        <w:spacing w:before="0" w:after="360" w:line="276" w:lineRule="auto"/>
-      </w:pPr>
-      <w:r>
-        <w:t> </w:t>
+        <w:t>&lt;CIUDAD&gt;</w:t>
       </w:r>
     </w:p>
     <w:p>
       <w:pPr>
         <w:pStyle w:val="Portada-Centrado"/>
-        <w:spacing w:before="200" w:after="240" w:line="276" w:lineRule="auto"/>
+        <w:spacing w:after="140" w:line="276" w:lineRule="auto"/>
       </w:pPr>
       <w:r>
-        <w:rPr>
-          <w:sz w:val="28"/>
-        </w:rPr>
-        <w:t>PARA OPTAR EL GRADO ACADÉMICO DE:</w:t>
+        <w:t>&lt;ANO&gt;</w:t>
       </w:r>
     </w:p>
     <w:p>
       <w:pPr>
         <w:pStyle w:val="Portada-Centrado"/>
-        <w:spacing w:after="200" w:line="276" w:lineRule="auto"/>
-      </w:pPr>
-      <w:r>
-        <w:rPr>
-          <w:b/>
-          <w:bCs/>
-          <w:sz w:val="32"/>
-        </w:rPr>
-        <w:t>MAESTRO(A) EN INGENIERÍA DE SOFTWARE</w:t>
-      </w:r>
+        <w:spacing w:before="0" w:after="360" w:line="276" w:lineRule="auto"/>
+      </w:pPr>
+      <w:r/>
     </w:p>
     <w:p>
       <w:pPr>
         <w:pStyle w:val="Portada-Centrado"/>
-        <w:spacing w:before="0" w:after="360" w:line="276" w:lineRule="auto"/>
-      </w:pPr>
-      <w:r>
-        <w:t> </w:t>
-      </w:r>
+        <w:spacing w:before="200" w:after="240" w:line="276" w:lineRule="auto"/>
+      </w:pPr>
+      <w:r/>
     </w:p>
     <w:p>
       <w:pPr>
         <w:pStyle w:val="Portada-Centrado"/>
-        <w:spacing w:line="276" w:lineRule="auto"/>
-      </w:pPr>
-      <w:r>
-        <w:rPr>
-          <w:b/>
-          <w:bCs/>
-          <w:sz w:val="26"/>
-        </w:rPr>
-        <w:t>LIMA</w:t>
-      </w:r>
+        <w:spacing w:after="200" w:line="276" w:lineRule="auto"/>
+      </w:pPr>
+      <w:r/>
     </w:p>
     <w:p>
       <w:pPr>
         <w:pStyle w:val="Portada-Centrado"/>
+        <w:spacing w:before="0" w:after="360" w:line="276" w:lineRule="auto"/>
+      </w:pPr>
+      <w:r/>
+    </w:p>
+    <w:p>
+      <w:pPr>
+        <w:pStyle w:val="Portada-Centrado"/>
         <w:spacing w:line="276" w:lineRule="auto"/>
       </w:pPr>
-      <w:r>
-        <w:rPr>
-          <w:b/>
-          <w:bCs/>
-          <w:sz w:val="26"/>
-        </w:rPr>
-        <w:t>2026</w:t>
-      </w:r>
+      <w:r/>
+    </w:p>
+    <w:p>
+      <w:pPr>
+        <w:pStyle w:val="Portada-Centrado"/>
+        <w:spacing w:line="276" w:lineRule="auto"/>
+      </w:pPr>
+      <w:r/>
     </w:p>
     <w:sectPr>
       <w:footerReference w:type="even" r:id="rId8"/>

</xml_diff>